<commit_message>
fix(resume): render bold skill labels correctly + trim resume5 to one page
Skills section fix (src/html-generator.js): the label/value split ran
indexOf(':') on the raw markdown, so a source label like `**Languages:**`
(colon inside the bold markers) was cut into `**Languages` + `** JavaScript`,
leaving unclosed `**` that marked rendered as literal asterisks. Now the
splitter leaves already-bolded labels intact for marked to render, and only
synthesizes bold for the legacy unbolded `Languages:` form. Handles all three
label styles (`Languages:`, `**Languages**:`, `**Languages:**`).

Content: removed the husko.money project from resume5; tightened print-mode
section/experience/header spacing in resume.css so resume5 fits on one page.

Regenerated resume5 .html/.pdf/.docx (all derive from the HTML generator).
Source resume5.md edited only to drop the husko.money line per request.

Co-Authored-By: Claude Opus 4.8 <noreply@anthropic.com>
</commit_message>
<xml_diff>
--- a/anthony.ettinger.resume5.docx
+++ b/anthony.ettinger.resume5.docx
@@ -99,52 +99,48 @@
         <w:t xml:space="preserve">Co-founded, served as CTO. Corporate travel platform.</w:t>
       </w:r>
     </w:p>
-    <w:p>
-      <w:pPr>
-        <w:pStyle w:val="BodyText"/>
+    <w:bookmarkEnd w:id="9"/>
+    <w:bookmarkStart w:id="10" w:name="core-skills"/>
+    <w:p>
+      <w:pPr>
+        <w:pStyle w:val="Heading2"/>
+      </w:pPr>
+      <w:r>
+        <w:t xml:space="preserve">Core Skills</w:t>
+      </w:r>
+    </w:p>
+    <w:p>
+      <w:pPr>
+        <w:pStyle w:val="FirstParagraph"/>
       </w:pPr>
       <w:r>
         <w:rPr>
           <w:b/>
           <w:bCs/>
         </w:rPr>
-        <w:t xml:space="preserve">husko.money</w:t>
-      </w:r>
-    </w:p>
-    <w:p>
-      <w:pPr>
-        <w:pStyle w:val="BodyText"/>
-      </w:pPr>
-      <w:r>
-        <w:t xml:space="preserve">NFT project on Polygon. Front-end to contract integration.</w:t>
-      </w:r>
-    </w:p>
-    <w:bookmarkEnd w:id="9"/>
-    <w:bookmarkStart w:id="10" w:name="core-skills"/>
-    <w:p>
-      <w:pPr>
-        <w:pStyle w:val="Heading2"/>
-      </w:pPr>
-      <w:r>
-        <w:t xml:space="preserve">Core Skills</w:t>
-      </w:r>
-    </w:p>
-    <w:p>
-      <w:pPr>
-        <w:pStyle w:val="FirstParagraph"/>
-      </w:pPr>
+        <w:t xml:space="preserve">Languages:</w:t>
+      </w:r>
+      <w:r>
+        <w:t xml:space="preserve"> </w:t>
+      </w:r>
+      <w:r>
+        <w:t xml:space="preserve">JavaScript, TypeScript, Node.js, PHP, Perl, Go</w:t>
+      </w:r>
+      <w:r>
+        <w:t xml:space="preserve"> </w:t>
+      </w:r>
       <w:r>
         <w:rPr>
           <w:b/>
           <w:bCs/>
         </w:rPr>
-        <w:t xml:space="preserve">**Languages:</w:t>
-      </w:r>
-      <w:r>
-        <w:t xml:space="preserve"> </w:t>
-      </w:r>
-      <w:r>
-        <w:t xml:space="preserve">** JavaScript, TypeScript, Node.js, PHP, Perl, Go</w:t>
+        <w:t xml:space="preserve">Front-End:</w:t>
+      </w:r>
+      <w:r>
+        <w:t xml:space="preserve"> </w:t>
+      </w:r>
+      <w:r>
+        <w:t xml:space="preserve">React, Svelte/SvelteKit, vanilla JS, Tailwind, accessible UI</w:t>
       </w:r>
       <w:r>
         <w:t xml:space="preserve"> </w:t>
@@ -154,13 +150,13 @@
           <w:b/>
           <w:bCs/>
         </w:rPr>
-        <w:t xml:space="preserve">**Front-End:</w:t>
-      </w:r>
-      <w:r>
-        <w:t xml:space="preserve"> </w:t>
-      </w:r>
-      <w:r>
-        <w:t xml:space="preserve">** React, Svelte/SvelteKit, vanilla JS, Tailwind, accessible UI</w:t>
+        <w:t xml:space="preserve">Back-End:</w:t>
+      </w:r>
+      <w:r>
+        <w:t xml:space="preserve"> </w:t>
+      </w:r>
+      <w:r>
+        <w:t xml:space="preserve">Express, Fastify, REST, webhooks, auth, service architecture</w:t>
       </w:r>
       <w:r>
         <w:t xml:space="preserve"> </w:t>
@@ -170,13 +166,13 @@
           <w:b/>
           <w:bCs/>
         </w:rPr>
-        <w:t xml:space="preserve">**Back-End:</w:t>
-      </w:r>
-      <w:r>
-        <w:t xml:space="preserve"> </w:t>
-      </w:r>
-      <w:r>
-        <w:t xml:space="preserve">** Express, Fastify, REST, webhooks, auth, service architecture</w:t>
+        <w:t xml:space="preserve">Data:</w:t>
+      </w:r>
+      <w:r>
+        <w:t xml:space="preserve"> </w:t>
+      </w:r>
+      <w:r>
+        <w:t xml:space="preserve">PostgreSQL, Supabase, MongoDB, pipeline work</w:t>
       </w:r>
       <w:r>
         <w:t xml:space="preserve"> </w:t>
@@ -186,13 +182,13 @@
           <w:b/>
           <w:bCs/>
         </w:rPr>
-        <w:t xml:space="preserve">**Data:</w:t>
-      </w:r>
-      <w:r>
-        <w:t xml:space="preserve"> </w:t>
-      </w:r>
-      <w:r>
-        <w:t xml:space="preserve">** PostgreSQL, Supabase, MongoDB, pipeline work</w:t>
+        <w:t xml:space="preserve">AI/LLM:</w:t>
+      </w:r>
+      <w:r>
+        <w:t xml:space="preserve"> </w:t>
+      </w:r>
+      <w:r>
+        <w:t xml:space="preserve">Claude Code, Codex, Cursor, RooCode, Copilot, local LLMs, RAG, vLLM</w:t>
       </w:r>
       <w:r>
         <w:t xml:space="preserve"> </w:t>
@@ -202,13 +198,13 @@
           <w:b/>
           <w:bCs/>
         </w:rPr>
-        <w:t xml:space="preserve">**AI/LLM:</w:t>
-      </w:r>
-      <w:r>
-        <w:t xml:space="preserve"> </w:t>
-      </w:r>
-      <w:r>
-        <w:t xml:space="preserve">** Claude Code, Codex, Cursor, RooCode, Copilot, local LLMs, RAG, vLLM</w:t>
+        <w:t xml:space="preserve">DevOps:</w:t>
+      </w:r>
+      <w:r>
+        <w:t xml:space="preserve"> </w:t>
+      </w:r>
+      <w:r>
+        <w:t xml:space="preserve">Docker, GitHub Actions, Linux, NGINX, Railway, CI/CD</w:t>
       </w:r>
       <w:r>
         <w:t xml:space="preserve"> </w:t>
@@ -218,13 +214,13 @@
           <w:b/>
           <w:bCs/>
         </w:rPr>
-        <w:t xml:space="preserve">**DevOps:</w:t>
-      </w:r>
-      <w:r>
-        <w:t xml:space="preserve"> </w:t>
-      </w:r>
-      <w:r>
-        <w:t xml:space="preserve">** Docker, GitHub Actions, Linux, NGINX, Railway, CI/CD</w:t>
+        <w:t xml:space="preserve">Web3:</w:t>
+      </w:r>
+      <w:r>
+        <w:t xml:space="preserve"> </w:t>
+      </w:r>
+      <w:r>
+        <w:t xml:space="preserve">Ethers.js, web3.js, Polygon, wallet integrations, non-custodial flows</w:t>
       </w:r>
       <w:r>
         <w:t xml:space="preserve"> </w:t>
@@ -234,29 +230,13 @@
           <w:b/>
           <w:bCs/>
         </w:rPr>
-        <w:t xml:space="preserve">**Web3:</w:t>
-      </w:r>
-      <w:r>
-        <w:t xml:space="preserve"> </w:t>
-      </w:r>
-      <w:r>
-        <w:t xml:space="preserve">** Ethers.js, web3.js, Polygon, wallet integrations, non-custodial flows</w:t>
-      </w:r>
-      <w:r>
-        <w:t xml:space="preserve"> </w:t>
-      </w:r>
-      <w:r>
-        <w:rPr>
-          <w:b/>
-          <w:bCs/>
-        </w:rPr>
-        <w:t xml:space="preserve">**Testing:</w:t>
-      </w:r>
-      <w:r>
-        <w:t xml:space="preserve"> </w:t>
-      </w:r>
-      <w:r>
-        <w:t xml:space="preserve">** Vitest, Jest, Chai, component and E2E patterns</w:t>
+        <w:t xml:space="preserve">Testing:</w:t>
+      </w:r>
+      <w:r>
+        <w:t xml:space="preserve"> </w:t>
+      </w:r>
+      <w:r>
+        <w:t xml:space="preserve">Vitest, Jest, Chai, component and E2E patterns</w:t>
       </w:r>
     </w:p>
     <w:bookmarkEnd w:id="10"/>

</xml_diff>